<commit_message>
fixing space picture and more
</commit_message>
<xml_diff>
--- a/03 บทคัดย่อ ใหม่.docx
+++ b/03 บทคัดย่อ ใหม่.docx
@@ -34,7 +34,49 @@
         <w:rPr>
           <w:cs/>
         </w:rPr>
-        <w:t>รัชช์ชกฤตย์ กิตติโชคธนวัชร</w:t>
+        <w:t>รัช</w:t>
+      </w:r>
+      <w:proofErr w:type="spellStart"/>
+      <w:r>
+        <w:rPr>
+          <w:cs/>
+        </w:rPr>
+        <w:t>ช์</w:t>
+      </w:r>
+      <w:proofErr w:type="spellEnd"/>
+      <w:r>
+        <w:rPr>
+          <w:cs/>
+        </w:rPr>
+        <w:t>ชกฤต</w:t>
+      </w:r>
+      <w:proofErr w:type="spellStart"/>
+      <w:r>
+        <w:rPr>
+          <w:cs/>
+        </w:rPr>
+        <w:t>ย์</w:t>
+      </w:r>
+      <w:proofErr w:type="spellEnd"/>
+      <w:r>
+        <w:rPr>
+          <w:cs/>
+        </w:rPr>
+        <w:t xml:space="preserve"> กิตติโชคธน</w:t>
+      </w:r>
+      <w:proofErr w:type="spellStart"/>
+      <w:r>
+        <w:rPr>
+          <w:cs/>
+        </w:rPr>
+        <w:t>วั</w:t>
+      </w:r>
+      <w:proofErr w:type="spellEnd"/>
+      <w:r>
+        <w:rPr>
+          <w:cs/>
+        </w:rPr>
+        <w:t>ชร</w:t>
       </w:r>
       <w:r>
         <w:rPr>
@@ -232,7 +274,20 @@
         <w:rPr>
           <w:cs/>
         </w:rPr>
-        <w:t>อาจารย์ดร.จักรพงศ์ พลพงศ์</w:t>
+        <w:t>อาจารย์</w:t>
+      </w:r>
+      <w:r>
+        <w:rPr>
+          <w:rFonts w:hint="cs"/>
+          <w:cs/>
+        </w:rPr>
+        <w:t xml:space="preserve"> </w:t>
+      </w:r>
+      <w:r>
+        <w:rPr>
+          <w:cs/>
+        </w:rPr>
+        <w:t>ดร.จักรพงศ์ พลพงศ์</w:t>
       </w:r>
     </w:p>
     <w:p>
@@ -335,10 +390,29 @@
         <w:rPr>
           <w:cs/>
         </w:rPr>
-        <w:t xml:space="preserve">สำหรับการจัดการเวิร์กโฟลว์อัตโนมัติ 2) ฐานข้อมูล </w:t>
-      </w:r>
-      <w:r>
-        <w:t xml:space="preserve">Supabase </w:t>
+        <w:t>สำหรับการจัดการ</w:t>
+      </w:r>
+      <w:proofErr w:type="spellStart"/>
+      <w:r>
+        <w:rPr>
+          <w:cs/>
+        </w:rPr>
+        <w:t>เวิร์กโฟลว์</w:t>
+      </w:r>
+      <w:proofErr w:type="spellEnd"/>
+      <w:r>
+        <w:rPr>
+          <w:cs/>
+        </w:rPr>
+        <w:t xml:space="preserve">อัตโนมัติ 2) ฐานข้อมูล </w:t>
+      </w:r>
+      <w:proofErr w:type="spellStart"/>
+      <w:r>
+        <w:t>Supabase</w:t>
+      </w:r>
+      <w:proofErr w:type="spellEnd"/>
+      <w:r>
+        <w:t xml:space="preserve"> </w:t>
       </w:r>
       <w:r>
         <w:rPr>
@@ -680,7 +754,10 @@
         <w:t>1</w:t>
       </w:r>
       <w:r>
-        <w:t>63</w:t>
+        <w:t>6</w:t>
+      </w:r>
+      <w:r>
+        <w:t>4</w:t>
       </w:r>
       <w:r>
         <w:t xml:space="preserve"> </w:t>
@@ -784,8 +861,21 @@
         <w:t>: Mr.</w:t>
       </w:r>
       <w:r>
-        <w:t xml:space="preserve"> Watcharin Sainan</w:t>
-      </w:r>
+        <w:t xml:space="preserve"> </w:t>
+      </w:r>
+      <w:proofErr w:type="spellStart"/>
+      <w:r>
+        <w:t>Watcharin</w:t>
+      </w:r>
+      <w:proofErr w:type="spellEnd"/>
+      <w:r>
+        <w:t xml:space="preserve"> </w:t>
+      </w:r>
+      <w:proofErr w:type="spellStart"/>
+      <w:r>
+        <w:t>Sainan</w:t>
+      </w:r>
+      <w:proofErr w:type="spellEnd"/>
     </w:p>
     <w:p>
       <w:pPr>
@@ -881,8 +971,21 @@
         <w:t xml:space="preserve">: </w:t>
       </w:r>
       <w:r>
-        <w:t>Dr. Jakkrapong Phonpong</w:t>
-      </w:r>
+        <w:t xml:space="preserve">Dr. </w:t>
+      </w:r>
+      <w:proofErr w:type="spellStart"/>
+      <w:r>
+        <w:t>Jakkrapong</w:t>
+      </w:r>
+      <w:proofErr w:type="spellEnd"/>
+      <w:r>
+        <w:t xml:space="preserve"> </w:t>
+      </w:r>
+      <w:proofErr w:type="spellStart"/>
+      <w:r>
+        <w:t>Phonpong</w:t>
+      </w:r>
+      <w:proofErr w:type="spellEnd"/>
     </w:p>
     <w:p>
       <w:pPr>
@@ -962,24 +1065,88 @@
           <w:sz w:val="32"/>
           <w:szCs w:val="32"/>
         </w:rPr>
-        <w:t>This research study had three objectives: 1) to develop an agentic AI assistant system for organizations, 2) to evaluate the efficiency of the developed agentic AI assistant system, and 3) to assess user satisfaction with the developed agentic AI assistant system in real-world usage. The tools used in development included: 1) n8n software for automated workflow management, 2) Supabase</w:t>
-      </w:r>
+        <w:t xml:space="preserve">This research study had three objectives: 1) to develop an agentic AI assistant system for organizations, 2) to evaluate the efficiency of the developed agentic AI assistant system, and 3) to assess user satisfaction with the developed agentic AI assistant system in real-world usage. The tools used in development included: 1) n8n software for automated workflow management, 2) </w:t>
+      </w:r>
+      <w:proofErr w:type="spellStart"/>
       <w:r>
         <w:rPr>
           <w:rFonts w:ascii="TH SarabunPSK" w:hAnsi="TH SarabunPSK" w:cs="TH SarabunPSK"/>
           <w:sz w:val="32"/>
           <w:szCs w:val="32"/>
-          <w:cs/>
-        </w:rPr>
-        <w:t xml:space="preserve"> </w:t>
-      </w:r>
+        </w:rPr>
+        <w:t>Supabase</w:t>
+      </w:r>
+      <w:proofErr w:type="spellEnd"/>
       <w:r>
         <w:rPr>
           <w:rFonts w:ascii="TH SarabunPSK" w:hAnsi="TH SarabunPSK" w:cs="TH SarabunPSK"/>
           <w:sz w:val="32"/>
           <w:szCs w:val="32"/>
-        </w:rPr>
-        <w:t>and PostgreSQL databases for data storage, and 3) the LINE Official Account platform combined with Retrieval-Augmented Generation (RAG) techniques for interaction and information retrieval. The system features identity verification via LINE LIFF using OTP codes sent by email, a time-attendance system (check-in/check-out), a meeting appointment management and advance notification system, a system for accessing and downloading personal documents and tax certificates (Withholding Tax Certificate / Por Ngor Dor 50), and automatic storage of payment transfer slips to Google Drive. The statistical methods used for data analysis were 1) the mean</w:t>
+          <w:cs/>
+        </w:rPr>
+        <w:t xml:space="preserve"> </w:t>
+      </w:r>
+      <w:r>
+        <w:rPr>
+          <w:rFonts w:ascii="TH SarabunPSK" w:hAnsi="TH SarabunPSK" w:cs="TH SarabunPSK"/>
+          <w:sz w:val="32"/>
+          <w:szCs w:val="32"/>
+        </w:rPr>
+        <w:t xml:space="preserve">and PostgreSQL databases for data storage, and 3) the LINE Official Account platform combined with Retrieval-Augmented Generation (RAG) techniques for interaction and information retrieval. The system </w:t>
+      </w:r>
+      <w:proofErr w:type="gramStart"/>
+      <w:r>
+        <w:rPr>
+          <w:rFonts w:ascii="TH SarabunPSK" w:hAnsi="TH SarabunPSK" w:cs="TH SarabunPSK"/>
+          <w:sz w:val="32"/>
+          <w:szCs w:val="32"/>
+        </w:rPr>
+        <w:t>features</w:t>
+      </w:r>
+      <w:proofErr w:type="gramEnd"/>
+      <w:r>
+        <w:rPr>
+          <w:rFonts w:ascii="TH SarabunPSK" w:hAnsi="TH SarabunPSK" w:cs="TH SarabunPSK"/>
+          <w:sz w:val="32"/>
+          <w:szCs w:val="32"/>
+        </w:rPr>
+        <w:t xml:space="preserve"> identity verification via LINE LIFF using OTP codes sent by email, a time-attendance system (check-in/check-out), a meeting appointment management and advance notification system, a system for accessing and downloading personal documents and tax certificates (Withholding Tax Certificate / Por </w:t>
+      </w:r>
+      <w:proofErr w:type="spellStart"/>
+      <w:r>
+        <w:rPr>
+          <w:rFonts w:ascii="TH SarabunPSK" w:hAnsi="TH SarabunPSK" w:cs="TH SarabunPSK"/>
+          <w:sz w:val="32"/>
+          <w:szCs w:val="32"/>
+        </w:rPr>
+        <w:t>Ngor</w:t>
+      </w:r>
+      <w:proofErr w:type="spellEnd"/>
+      <w:r>
+        <w:rPr>
+          <w:rFonts w:ascii="TH SarabunPSK" w:hAnsi="TH SarabunPSK" w:cs="TH SarabunPSK"/>
+          <w:sz w:val="32"/>
+          <w:szCs w:val="32"/>
+        </w:rPr>
+        <w:t xml:space="preserve"> </w:t>
+      </w:r>
+      <w:proofErr w:type="spellStart"/>
+      <w:r>
+        <w:rPr>
+          <w:rFonts w:ascii="TH SarabunPSK" w:hAnsi="TH SarabunPSK" w:cs="TH SarabunPSK"/>
+          <w:sz w:val="32"/>
+          <w:szCs w:val="32"/>
+        </w:rPr>
+        <w:t>Dor</w:t>
+      </w:r>
+      <w:proofErr w:type="spellEnd"/>
+      <w:r>
+        <w:rPr>
+          <w:rFonts w:ascii="TH SarabunPSK" w:hAnsi="TH SarabunPSK" w:cs="TH SarabunPSK"/>
+          <w:sz w:val="32"/>
+          <w:szCs w:val="32"/>
+        </w:rPr>
+        <w:t xml:space="preserve"> 50), and automatic storage of payment transfer slips to Google Drive. The statistical methods used for data analysis were 1) the mean</w:t>
       </w:r>
       <w:r>
         <w:rPr>
@@ -1076,7 +1243,21 @@
         <w:rPr>
           <w:rFonts w:eastAsia="Times New Roman"/>
         </w:rPr>
-        <w:t xml:space="preserve"> = 0.74) A satisfaction survey of 30 organizational employees also yielded the highest level rating with a mean score of 4.74 (</w:t>
+        <w:t xml:space="preserve"> = 0.74) A satisfaction survey of 30 organizational employees also yielded the </w:t>
+      </w:r>
+      <w:proofErr w:type="gramStart"/>
+      <w:r>
+        <w:rPr>
+          <w:rFonts w:eastAsia="Times New Roman"/>
+        </w:rPr>
+        <w:t>highest level</w:t>
+      </w:r>
+      <w:proofErr w:type="gramEnd"/>
+      <w:r>
+        <w:rPr>
+          <w:rFonts w:eastAsia="Times New Roman"/>
+        </w:rPr>
+        <w:t xml:space="preserve"> rating with a mean score of 4.74 (</w:t>
       </w:r>
       <m:oMath>
         <m:acc>
@@ -1122,7 +1303,10 @@
         <w:t>1</w:t>
       </w:r>
       <w:r>
-        <w:t>63</w:t>
+        <w:t>6</w:t>
+      </w:r>
+      <w:r>
+        <w:t>4</w:t>
       </w:r>
       <w:r>
         <w:t xml:space="preserve"> pages</w:t>

</xml_diff>

<commit_message>
fixing number title space in table of content
</commit_message>
<xml_diff>
--- a/03 บทคัดย่อ ใหม่.docx
+++ b/03 บทคัดย่อ ใหม่.docx
@@ -34,49 +34,7 @@
         <w:rPr>
           <w:cs/>
         </w:rPr>
-        <w:t>รัช</w:t>
-      </w:r>
-      <w:proofErr w:type="spellStart"/>
-      <w:r>
-        <w:rPr>
-          <w:cs/>
-        </w:rPr>
-        <w:t>ช์</w:t>
-      </w:r>
-      <w:proofErr w:type="spellEnd"/>
-      <w:r>
-        <w:rPr>
-          <w:cs/>
-        </w:rPr>
-        <w:t>ชกฤต</w:t>
-      </w:r>
-      <w:proofErr w:type="spellStart"/>
-      <w:r>
-        <w:rPr>
-          <w:cs/>
-        </w:rPr>
-        <w:t>ย์</w:t>
-      </w:r>
-      <w:proofErr w:type="spellEnd"/>
-      <w:r>
-        <w:rPr>
-          <w:cs/>
-        </w:rPr>
-        <w:t xml:space="preserve"> กิตติโชคธน</w:t>
-      </w:r>
-      <w:proofErr w:type="spellStart"/>
-      <w:r>
-        <w:rPr>
-          <w:cs/>
-        </w:rPr>
-        <w:t>วั</w:t>
-      </w:r>
-      <w:proofErr w:type="spellEnd"/>
-      <w:r>
-        <w:rPr>
-          <w:cs/>
-        </w:rPr>
-        <w:t>ชร</w:t>
+        <w:t>รัชช์ชกฤตย์ กิตติโชคธนวัชร</w:t>
       </w:r>
       <w:r>
         <w:rPr>
@@ -390,29 +348,10 @@
         <w:rPr>
           <w:cs/>
         </w:rPr>
-        <w:t>สำหรับการจัดการ</w:t>
-      </w:r>
-      <w:proofErr w:type="spellStart"/>
-      <w:r>
-        <w:rPr>
-          <w:cs/>
-        </w:rPr>
-        <w:t>เวิร์กโฟลว์</w:t>
-      </w:r>
-      <w:proofErr w:type="spellEnd"/>
-      <w:r>
-        <w:rPr>
-          <w:cs/>
-        </w:rPr>
-        <w:t xml:space="preserve">อัตโนมัติ 2) ฐานข้อมูล </w:t>
-      </w:r>
-      <w:proofErr w:type="spellStart"/>
-      <w:r>
-        <w:t>Supabase</w:t>
-      </w:r>
-      <w:proofErr w:type="spellEnd"/>
-      <w:r>
-        <w:t xml:space="preserve"> </w:t>
+        <w:t xml:space="preserve">สำหรับการจัดการเวิร์กโฟลว์อัตโนมัติ 2) ฐานข้อมูล </w:t>
+      </w:r>
+      <w:r>
+        <w:t xml:space="preserve">Supabase </w:t>
       </w:r>
       <w:r>
         <w:rPr>
@@ -798,7 +737,7 @@
         <w:t>คำสำคัญ : ระบบผู้ช่วยแบบตัวแทนเชิงปัญญาประดิษฐ์</w:t>
       </w:r>
       <w:r>
-        <w:t xml:space="preserve">, </w:t>
+        <w:t xml:space="preserve"> </w:t>
       </w:r>
       <w:r>
         <w:rPr>
@@ -861,21 +800,8 @@
         <w:t>: Mr.</w:t>
       </w:r>
       <w:r>
-        <w:t xml:space="preserve"> </w:t>
-      </w:r>
-      <w:proofErr w:type="spellStart"/>
-      <w:r>
-        <w:t>Watcharin</w:t>
-      </w:r>
-      <w:proofErr w:type="spellEnd"/>
-      <w:r>
-        <w:t xml:space="preserve"> </w:t>
-      </w:r>
-      <w:proofErr w:type="spellStart"/>
-      <w:r>
-        <w:t>Sainan</w:t>
-      </w:r>
-      <w:proofErr w:type="spellEnd"/>
+        <w:t xml:space="preserve"> Watcharin Sainan</w:t>
+      </w:r>
     </w:p>
     <w:p>
       <w:pPr>
@@ -971,21 +897,8 @@
         <w:t xml:space="preserve">: </w:t>
       </w:r>
       <w:r>
-        <w:t xml:space="preserve">Dr. </w:t>
-      </w:r>
-      <w:proofErr w:type="spellStart"/>
-      <w:r>
-        <w:t>Jakkrapong</w:t>
-      </w:r>
-      <w:proofErr w:type="spellEnd"/>
-      <w:r>
-        <w:t xml:space="preserve"> </w:t>
-      </w:r>
-      <w:proofErr w:type="spellStart"/>
-      <w:r>
-        <w:t>Phonpong</w:t>
-      </w:r>
-      <w:proofErr w:type="spellEnd"/>
+        <w:t>Dr. Jakkrapong Phonpong</w:t>
+      </w:r>
     </w:p>
     <w:p>
       <w:pPr>
@@ -1065,88 +978,24 @@
           <w:sz w:val="32"/>
           <w:szCs w:val="32"/>
         </w:rPr>
-        <w:t xml:space="preserve">This research study had three objectives: 1) to develop an agentic AI assistant system for organizations, 2) to evaluate the efficiency of the developed agentic AI assistant system, and 3) to assess user satisfaction with the developed agentic AI assistant system in real-world usage. The tools used in development included: 1) n8n software for automated workflow management, 2) </w:t>
-      </w:r>
-      <w:proofErr w:type="spellStart"/>
+        <w:t>This research study had three objectives: 1) to develop an agentic AI assistant system for organizations, 2) to evaluate the efficiency of the developed agentic AI assistant system, and 3) to assess user satisfaction with the developed agentic AI assistant system in real-world usage. The tools used in development included: 1) n8n software for automated workflow management, 2) Supabase</w:t>
+      </w:r>
       <w:r>
         <w:rPr>
           <w:rFonts w:ascii="TH SarabunPSK" w:hAnsi="TH SarabunPSK" w:cs="TH SarabunPSK"/>
           <w:sz w:val="32"/>
           <w:szCs w:val="32"/>
-        </w:rPr>
-        <w:t>Supabase</w:t>
-      </w:r>
-      <w:proofErr w:type="spellEnd"/>
+          <w:cs/>
+        </w:rPr>
+        <w:t xml:space="preserve"> </w:t>
+      </w:r>
       <w:r>
         <w:rPr>
           <w:rFonts w:ascii="TH SarabunPSK" w:hAnsi="TH SarabunPSK" w:cs="TH SarabunPSK"/>
           <w:sz w:val="32"/>
           <w:szCs w:val="32"/>
-          <w:cs/>
-        </w:rPr>
-        <w:t xml:space="preserve"> </w:t>
-      </w:r>
-      <w:r>
-        <w:rPr>
-          <w:rFonts w:ascii="TH SarabunPSK" w:hAnsi="TH SarabunPSK" w:cs="TH SarabunPSK"/>
-          <w:sz w:val="32"/>
-          <w:szCs w:val="32"/>
-        </w:rPr>
-        <w:t xml:space="preserve">and PostgreSQL databases for data storage, and 3) the LINE Official Account platform combined with Retrieval-Augmented Generation (RAG) techniques for interaction and information retrieval. The system </w:t>
-      </w:r>
-      <w:proofErr w:type="gramStart"/>
-      <w:r>
-        <w:rPr>
-          <w:rFonts w:ascii="TH SarabunPSK" w:hAnsi="TH SarabunPSK" w:cs="TH SarabunPSK"/>
-          <w:sz w:val="32"/>
-          <w:szCs w:val="32"/>
-        </w:rPr>
-        <w:t>features</w:t>
-      </w:r>
-      <w:proofErr w:type="gramEnd"/>
-      <w:r>
-        <w:rPr>
-          <w:rFonts w:ascii="TH SarabunPSK" w:hAnsi="TH SarabunPSK" w:cs="TH SarabunPSK"/>
-          <w:sz w:val="32"/>
-          <w:szCs w:val="32"/>
-        </w:rPr>
-        <w:t xml:space="preserve"> identity verification via LINE LIFF using OTP codes sent by email, a time-attendance system (check-in/check-out), a meeting appointment management and advance notification system, a system for accessing and downloading personal documents and tax certificates (Withholding Tax Certificate / Por </w:t>
-      </w:r>
-      <w:proofErr w:type="spellStart"/>
-      <w:r>
-        <w:rPr>
-          <w:rFonts w:ascii="TH SarabunPSK" w:hAnsi="TH SarabunPSK" w:cs="TH SarabunPSK"/>
-          <w:sz w:val="32"/>
-          <w:szCs w:val="32"/>
-        </w:rPr>
-        <w:t>Ngor</w:t>
-      </w:r>
-      <w:proofErr w:type="spellEnd"/>
-      <w:r>
-        <w:rPr>
-          <w:rFonts w:ascii="TH SarabunPSK" w:hAnsi="TH SarabunPSK" w:cs="TH SarabunPSK"/>
-          <w:sz w:val="32"/>
-          <w:szCs w:val="32"/>
-        </w:rPr>
-        <w:t xml:space="preserve"> </w:t>
-      </w:r>
-      <w:proofErr w:type="spellStart"/>
-      <w:r>
-        <w:rPr>
-          <w:rFonts w:ascii="TH SarabunPSK" w:hAnsi="TH SarabunPSK" w:cs="TH SarabunPSK"/>
-          <w:sz w:val="32"/>
-          <w:szCs w:val="32"/>
-        </w:rPr>
-        <w:t>Dor</w:t>
-      </w:r>
-      <w:proofErr w:type="spellEnd"/>
-      <w:r>
-        <w:rPr>
-          <w:rFonts w:ascii="TH SarabunPSK" w:hAnsi="TH SarabunPSK" w:cs="TH SarabunPSK"/>
-          <w:sz w:val="32"/>
-          <w:szCs w:val="32"/>
-        </w:rPr>
-        <w:t xml:space="preserve"> 50), and automatic storage of payment transfer slips to Google Drive. The statistical methods used for data analysis were 1) the mean</w:t>
+        </w:rPr>
+        <w:t>and PostgreSQL databases for data storage, and 3) the LINE Official Account platform combined with Retrieval-Augmented Generation (RAG) techniques for interaction and information retrieval. The system features identity verification via LINE LIFF using OTP codes sent by email, a time-attendance system (check-in/check-out), a meeting appointment management and advance notification system, a system for accessing and downloading personal documents and tax certificates (Withholding Tax Certificate / Por Ngor Dor 50), and automatic storage of payment transfer slips to Google Drive. The statistical methods used for data analysis were 1) the mean</w:t>
       </w:r>
       <w:r>
         <w:rPr>
@@ -1243,21 +1092,7 @@
         <w:rPr>
           <w:rFonts w:eastAsia="Times New Roman"/>
         </w:rPr>
-        <w:t xml:space="preserve"> = 0.74) A satisfaction survey of 30 organizational employees also yielded the </w:t>
-      </w:r>
-      <w:proofErr w:type="gramStart"/>
-      <w:r>
-        <w:rPr>
-          <w:rFonts w:eastAsia="Times New Roman"/>
-        </w:rPr>
-        <w:t>highest level</w:t>
-      </w:r>
-      <w:proofErr w:type="gramEnd"/>
-      <w:r>
-        <w:rPr>
-          <w:rFonts w:eastAsia="Times New Roman"/>
-        </w:rPr>
-        <w:t xml:space="preserve"> rating with a mean score of 4.74 (</w:t>
+        <w:t xml:space="preserve"> = 0.74) A satisfaction survey of 30 organizational employees also yielded the highest level rating with a mean score of 4.74 (</w:t>
       </w:r>
       <m:oMath>
         <m:acc>
@@ -1338,7 +1173,13 @@
         <w:ind w:left="1134" w:hanging="1134"/>
       </w:pPr>
       <w:r>
-        <w:t>Keywords: AI Agent Assistant System, Artificial Intelligence Agent</w:t>
+        <w:t>Keywords: AI Agent Assistant System</w:t>
+      </w:r>
+      <w:r>
+        <w:t>,</w:t>
+      </w:r>
+      <w:r>
+        <w:t xml:space="preserve"> Artificial Intelligence Agent</w:t>
       </w:r>
     </w:p>
     <w:p>

</xml_diff>